<commit_message>
Update Mind Mate app
</commit_message>
<xml_diff>
--- a/Mind_Mate_PRD_v3.docx
+++ b/Mind_Mate_PRD_v3.docx
@@ -7,7 +7,13 @@
         <w:pStyle w:val="Title"/>
       </w:pPr>
       <w:r>
-        <w:t>Mind Mate – Thought Awareness &amp; Transformation App</w:t>
+        <w:t xml:space="preserve">Mind </w:t>
+      </w:r>
+      <w:r>
+        <w:t>Map</w:t>
+      </w:r>
+      <w:r>
+        <w:t xml:space="preserve"> – Thought Awareness &amp; Transformation App</w:t>
       </w:r>
     </w:p>
     <w:p>

</xml_diff>